<commit_message>
fix(tables): regenerate standalone Table_1 from Pass 27 cyclone values
The standalone Table_1.{docx,pdf} carried stale pre-Pass-27 cyclone
data — Fani wind 240, Amphan landfall 'Bhadrak / Balasore boundary',
Yaas wind 155, Fani category 'Very Severe' (should be Extremely
Severe). The inline Table 1 in Manuscript.{docx,pdf} has been
correct since Pass 27 but the standalone build script
(scripts/build_main_text_tables.py) was not updated then.

Fix: update build_main_text_tables.py to match the inline Table 1
verbatim (Fani 215/185 ESCS Puri 1.0-1.5; Amphan 240/155-165 SuCS
Bakkhali WB Sundarbans 1.5-2.0; Yaas 140 gust 155 VSCS Balasore
1.0-2.0), rebuild Table_1.docx via python-docx, re-export PDF via
libreoffice.

Table_2 unchanged in source but rebuilt for cleanliness.

Audit: 0 issues.
</commit_message>
<xml_diff>
--- a/manuscript/Table_1.docx
+++ b/manuscript/Table_1.docx
@@ -231,7 +231,7 @@
                 <w:b w:val="0"/>
                 <w:sz w:val="18"/>
               </w:rPr>
-              <w:t>240</w:t>
+              <w:t>215 (peak) / 185 (landfall)</w:t>
             </w:r>
           </w:p>
         </w:tc>
@@ -251,7 +251,7 @@
                 <w:b w:val="0"/>
                 <w:sz w:val="18"/>
               </w:rPr>
-              <w:t>Very Severe Cyclonic Storm (ESCS)</w:t>
+              <w:t>Extremely Severe Cyclonic Storm (ESCS)</w:t>
             </w:r>
           </w:p>
         </w:tc>
@@ -353,7 +353,7 @@
                 <w:b w:val="0"/>
                 <w:sz w:val="18"/>
               </w:rPr>
-              <w:t>185</w:t>
+              <w:t>240 (peak) / 155–165 (landfall)</w:t>
             </w:r>
           </w:p>
         </w:tc>
@@ -393,7 +393,7 @@
                 <w:b w:val="0"/>
                 <w:sz w:val="18"/>
               </w:rPr>
-              <w:t>Bhadrak / Balasore boundary</w:t>
+              <w:t>Bakkhali, West Bengal (Sundarbans)</w:t>
             </w:r>
           </w:p>
         </w:tc>
@@ -475,7 +475,7 @@
                 <w:b w:val="0"/>
                 <w:sz w:val="18"/>
               </w:rPr>
-              <w:t>155</w:t>
+              <w:t>140 (peak, gusting to 155)</w:t>
             </w:r>
           </w:p>
         </w:tc>

</xml_diff>